<commit_message>
test(corpus): level 1 in the defaults of E-list-level-linked-defaults
Level 0 is also the level Word may fall back to, so a label of level 0
could not tell whether Word took the defaults' level; level 1 tells the
three answers apart. The test pins the first-row format's colour and grey
of E-table-style-header-rows-3-* and checks that the levels of each list
render labels of their own.
</commit_message>
<xml_diff>
--- a/tests/corpus/word-rules/E-list-level-linked-defaults.docx
+++ b/tests/corpus/word-rules/E-list-level-linked-defaults.docx
@@ -7,12 +7,12 @@
         <w:pStyle w:val="LinkedDefaults"/>
       </w:pPr>
       <w:r>
-        <w:t xml:space="preserve">Case 01: the style LinkedDefaults gives instance 1 and no level, the document defaults give level 0; level 2 names the style</w:t>
+        <w:t xml:space="preserve">Case 01: the style LinkedDefaults gives instance 1 and no level, the document defaults give level 1; level 2 names the style</w:t>
       </w:r>
     </w:p>
     <w:p>
       <w:r>
-        <w:t xml:space="preserve">Case 02: a paragraph in Normal, which has level 0 from the document defaults but no list</w:t>
+        <w:t xml:space="preserve">Case 02: a paragraph in Normal, which has level 1 from the document defaults but no list</w:t>
       </w:r>
     </w:p>
     <w:sectPr>
@@ -80,7 +80,7 @@
       <w:pPr>
         <w:widowControl/>
         <w:numPr>
-          <w:ilvl w:val="0"/>
+          <w:ilvl w:val="1"/>
         </w:numPr>
         <w:spacing w:after="0" w:line="240" w:lineRule="auto"/>
       </w:pPr>

</xml_diff>